<commit_message>
release: v2.5.0 - Planilla de Fotos Datasheet, Módulo EE, Reordenamiento de UI y Múltiples Marcas
</commit_message>
<xml_diff>
--- a/ejemplos/DJ Conformidad Modelo EE (1).docx
+++ b/ejemplos/DJ Conformidad Modelo EE (1).docx
@@ -64,7 +64,6 @@
         <w:tc>
           <w:tcPr>
             <w:tcW w:w="3139" w:type="dxa"/>
-            <w:shd w:val="clear" w:color="auto" w:fill="auto"/>
             <w:tcMar>
               <w:top w:w="100" w:type="dxa"/>
               <w:left w:w="100" w:type="dxa"/>
@@ -140,7 +139,47 @@
                 <w:sz w:val="16"/>
                 <w:szCs w:val="16"/>
               </w:rPr>
-              <w:t>DJC-EE-0526-C877-COD-V1</w:t>
+              <w:t>DJC-EE-</w:t>
+            </w:r>
+            <w:r>
+              <w:rPr>
+                <w:rFonts w:ascii="Arial" w:eastAsia="Arial" w:hAnsi="Arial" w:cs="Arial"/>
+                <w:sz w:val="16"/>
+                <w:szCs w:val="16"/>
+              </w:rPr>
+              <w:t>XXYY</w:t>
+            </w:r>
+            <w:r>
+              <w:rPr>
+                <w:rFonts w:ascii="Arial" w:eastAsia="Arial" w:hAnsi="Arial" w:cs="Arial"/>
+                <w:sz w:val="16"/>
+                <w:szCs w:val="16"/>
+              </w:rPr>
+              <w:t>-C</w:t>
+            </w:r>
+            <w:r>
+              <w:rPr>
+                <w:rFonts w:ascii="Arial" w:eastAsia="Arial" w:hAnsi="Arial" w:cs="Arial"/>
+                <w:sz w:val="16"/>
+                <w:szCs w:val="16"/>
+              </w:rPr>
+              <w:t>ZZZ</w:t>
+            </w:r>
+            <w:r>
+              <w:rPr>
+                <w:rFonts w:ascii="Arial" w:eastAsia="Arial" w:hAnsi="Arial" w:cs="Arial"/>
+                <w:sz w:val="16"/>
+                <w:szCs w:val="16"/>
+              </w:rPr>
+              <w:t>-V</w:t>
+            </w:r>
+            <w:r>
+              <w:rPr>
+                <w:rFonts w:ascii="Arial" w:eastAsia="Arial" w:hAnsi="Arial" w:cs="Arial"/>
+                <w:sz w:val="16"/>
+                <w:szCs w:val="16"/>
+              </w:rPr>
+              <w:t>1</w:t>
             </w:r>
           </w:p>
         </w:tc>
@@ -209,7 +248,7 @@
         <mc:AlternateContent>
           <mc:Choice Requires="wpg">
             <w:drawing>
-              <wp:anchor distT="0" distB="0" distL="0" distR="0" simplePos="0" relativeHeight="251658240" behindDoc="0" locked="0" layoutInCell="1" hidden="0" allowOverlap="1" wp14:anchorId="1FF4D240" wp14:editId="0E32B64C">
+              <wp:anchor distT="0" distB="0" distL="0" distR="0" simplePos="0" relativeHeight="251658240" behindDoc="0" locked="0" layoutInCell="1" hidden="0" allowOverlap="1" wp14:anchorId="02BC4121" wp14:editId="0B1B3A4D">
                 <wp:simplePos x="0" y="0"/>
                 <wp:positionH relativeFrom="column">
                   <wp:posOffset>152400</wp:posOffset>
@@ -235,7 +274,7 @@
                         </a:xfrm>
                       </wpg:grpSpPr>
                       <wpg:grpSp>
-                        <wpg:cNvPr id="1006601313" name="Grupo 1006601313"/>
+                        <wpg:cNvPr id="1406047130" name="Grupo 1406047130"/>
                         <wpg:cNvGrpSpPr/>
                         <wpg:grpSpPr>
                           <a:xfrm>
@@ -246,7 +285,7 @@
                           </a:xfrm>
                         </wpg:grpSpPr>
                         <wps:wsp>
-                          <wps:cNvPr id="1670134431" name="Rectángulo 1670134431"/>
+                          <wps:cNvPr id="836155417" name="Rectángulo 836155417"/>
                           <wps:cNvSpPr/>
                           <wps:spPr>
                             <a:xfrm>
@@ -275,7 +314,7 @@
                           </wps:bodyPr>
                         </wps:wsp>
                         <wps:wsp>
-                          <wps:cNvPr id="1297828457" name="Conector recto de flecha 1297828457"/>
+                          <wps:cNvPr id="1464282819" name="Conector recto de flecha 1464282819"/>
                           <wps:cNvCnPr/>
                           <wps:spPr>
                             <a:xfrm>
@@ -299,7 +338,7 @@
                           <wps:bodyPr/>
                         </wps:wsp>
                         <wps:wsp>
-                          <wps:cNvPr id="1685525825" name="Rectángulo 1685525825"/>
+                          <wps:cNvPr id="301909010" name="Rectángulo 301909010"/>
                           <wps:cNvSpPr/>
                           <wps:spPr>
                             <a:xfrm>
@@ -330,7 +369,7 @@
                           </wps:bodyPr>
                         </wps:wsp>
                         <wps:wsp>
-                          <wps:cNvPr id="1202420528" name="Rectángulo 1202420528"/>
+                          <wps:cNvPr id="1091495845" name="Rectángulo 1091495845"/>
                           <wps:cNvSpPr/>
                           <wps:spPr>
                             <a:xfrm>
@@ -361,7 +400,7 @@
                           </wps:bodyPr>
                         </wps:wsp>
                         <wps:wsp>
-                          <wps:cNvPr id="2106409941" name="Conector recto de flecha 2106409941"/>
+                          <wps:cNvPr id="125391643" name="Conector recto de flecha 125391643"/>
                           <wps:cNvCnPr/>
                           <wps:spPr>
                             <a:xfrm>
@@ -385,7 +424,7 @@
                           <wps:bodyPr/>
                         </wps:wsp>
                         <wps:wsp>
-                          <wps:cNvPr id="2135752689" name="Rectángulo 2135752689"/>
+                          <wps:cNvPr id="536921241" name="Rectángulo 536921241"/>
                           <wps:cNvSpPr/>
                           <wps:spPr>
                             <a:xfrm>
@@ -416,7 +455,7 @@
                           </wps:bodyPr>
                         </wps:wsp>
                         <wps:wsp>
-                          <wps:cNvPr id="335221211" name="Rectángulo 335221211"/>
+                          <wps:cNvPr id="1681986997" name="Rectángulo 1681986997"/>
                           <wps:cNvSpPr/>
                           <wps:spPr>
                             <a:xfrm>
@@ -447,7 +486,7 @@
                           </wps:bodyPr>
                         </wps:wsp>
                         <wps:wsp>
-                          <wps:cNvPr id="1285446095" name="Rectángulo 1285446095"/>
+                          <wps:cNvPr id="1225318304" name="Rectángulo 1225318304"/>
                           <wps:cNvSpPr/>
                           <wps:spPr>
                             <a:xfrm>
@@ -478,7 +517,7 @@
                           </wps:bodyPr>
                         </wps:wsp>
                         <wps:wsp>
-                          <wps:cNvPr id="1506717558" name="Rectángulo 1506717558"/>
+                          <wps:cNvPr id="376797407" name="Rectángulo 376797407"/>
                           <wps:cNvSpPr/>
                           <wps:spPr>
                             <a:xfrm>
@@ -509,7 +548,7 @@
                           </wps:bodyPr>
                         </wps:wsp>
                         <wps:wsp>
-                          <wps:cNvPr id="993780408" name="Rectángulo 993780408"/>
+                          <wps:cNvPr id="1312221206" name="Rectángulo 1312221206"/>
                           <wps:cNvSpPr/>
                           <wps:spPr>
                             <a:xfrm>
@@ -540,7 +579,7 @@
                           </wps:bodyPr>
                         </wps:wsp>
                         <wps:wsp>
-                          <wps:cNvPr id="189920376" name="Rectángulo 189920376"/>
+                          <wps:cNvPr id="1219830475" name="Rectángulo 1219830475"/>
                           <wps:cNvSpPr/>
                           <wps:spPr>
                             <a:xfrm>
@@ -571,7 +610,7 @@
                           </wps:bodyPr>
                         </wps:wsp>
                         <wps:wsp>
-                          <wps:cNvPr id="20510125" name="Conector recto de flecha 20510125"/>
+                          <wps:cNvPr id="1928193281" name="Conector recto de flecha 1928193281"/>
                           <wps:cNvCnPr/>
                           <wps:spPr>
                             <a:xfrm>
@@ -595,7 +634,7 @@
                           <wps:bodyPr/>
                         </wps:wsp>
                         <wps:wsp>
-                          <wps:cNvPr id="1073318968" name="Rectángulo 1073318968"/>
+                          <wps:cNvPr id="1717739771" name="Rectángulo 1717739771"/>
                           <wps:cNvSpPr/>
                           <wps:spPr>
                             <a:xfrm>
@@ -626,7 +665,7 @@
                           </wps:bodyPr>
                         </wps:wsp>
                         <wps:wsp>
-                          <wps:cNvPr id="1672203367" name="Rectángulo 1672203367"/>
+                          <wps:cNvPr id="2019658124" name="Rectángulo 2019658124"/>
                           <wps:cNvSpPr/>
                           <wps:spPr>
                             <a:xfrm>
@@ -663,142 +702,47 @@
               </wp:anchor>
             </w:drawing>
           </mc:Choice>
-          <mc:Fallback>
-            <w:pict>
-              <v:group w14:anchorId="1FF4D240" id="Grupo 1" o:spid="_x0000_s1026" style="position:absolute;margin-left:12pt;margin-top:8pt;width:442pt;height:1.6pt;z-index:251658240;mso-wrap-distance-left:0;mso-wrap-distance-right:0" coordorigin="25386,37669" coordsize="56134,260" o:gfxdata="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">
-                <v:group id="Grupo 1006601313" o:spid="_x0000_s1027" style="position:absolute;left:25386;top:37698;width:56134;height:197" coordorigin="1701,172" coordsize="8840,31" o:gfxdata="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">
-                  <v:rect id="Rectángulo 1670134431" o:spid="_x0000_s1028" style="position:absolute;left:1702;top:172;width:8825;height:25;visibility:visible;mso-wrap-style:square;v-text-anchor:middle" o:gfxdata="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" filled="f" stroked="f">
-                    <v:textbox inset="2.53958mm,2.53958mm,2.53958mm,2.53958mm">
-                      <w:txbxContent>
-                        <w:p>
-                          <w:pPr>
-                            <w:textDirection w:val="btLr"/>
-                          </w:pPr>
-                        </w:p>
-                      </w:txbxContent>
-                    </v:textbox>
-                  </v:rect>
-                  <v:shapetype id="_x0000_t32" coordsize="21600,21600" o:spt="32" o:oned="t" path="m,l21600,21600e" filled="f">
-                    <v:path arrowok="t" fillok="f" o:connecttype="none"/>
-                    <o:lock v:ext="edit" shapetype="t"/>
-                  </v:shapetype>
-                  <v:shape id="Conector recto de flecha 1297828457" o:spid="_x0000_s1029" type="#_x0000_t32" style="position:absolute;left:1702;top:188;width:8839;height:0;visibility:visible;mso-wrap-style:square" o:connectortype="straight" o:gfxdata="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" strokecolor="#a1a1a1" strokeweight=".56389mm"/>
-                  <v:rect id="Rectángulo 1685525825" o:spid="_x0000_s1030" style="position:absolute;left:1701;top:172;width:5;height:5;visibility:visible;mso-wrap-style:square;v-text-anchor:middle" o:gfxdata="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" fillcolor="#a1a1a1" stroked="f">
-                    <v:textbox inset="2.53958mm,2.53958mm,2.53958mm,2.53958mm">
-                      <w:txbxContent>
-                        <w:p>
-                          <w:pPr>
-                            <w:textDirection w:val="btLr"/>
-                          </w:pPr>
-                        </w:p>
-                      </w:txbxContent>
-                    </v:textbox>
-                  </v:rect>
-                  <v:rect id="Rectángulo 1202420528" o:spid="_x0000_s1031" style="position:absolute;left:1701;top:172;width:5;height:5;visibility:visible;mso-wrap-style:square;v-text-anchor:middle" o:gfxdata="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" fillcolor="#a1a1a1" stroked="f">
-                    <v:textbox inset="2.53958mm,2.53958mm,2.53958mm,2.53958mm">
-                      <w:txbxContent>
-                        <w:p>
-                          <w:pPr>
-                            <w:textDirection w:val="btLr"/>
-                          </w:pPr>
-                        </w:p>
-                      </w:txbxContent>
-                    </v:textbox>
-                  </v:rect>
-                  <v:shape id="Conector recto de flecha 2106409941" o:spid="_x0000_s1032" type="#_x0000_t32" style="position:absolute;left:1706;top:175;width:8830;height:0;visibility:visible;mso-wrap-style:square" o:connectortype="straight" o:gfxdata="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" strokecolor="#a1a1a1"/>
-                  <v:rect id="Rectángulo 2135752689" o:spid="_x0000_s1033" style="position:absolute;left:10536;top:172;width:5;height:5;visibility:visible;mso-wrap-style:square;v-text-anchor:middle" o:gfxdata="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" fillcolor="#e4e4e4" stroked="f">
-                    <v:textbox inset="2.53958mm,2.53958mm,2.53958mm,2.53958mm">
-                      <w:txbxContent>
-                        <w:p>
-                          <w:pPr>
-                            <w:textDirection w:val="btLr"/>
-                          </w:pPr>
-                        </w:p>
-                      </w:txbxContent>
-                    </v:textbox>
-                  </v:rect>
-                  <v:rect id="Rectángulo 335221211" o:spid="_x0000_s1034" style="position:absolute;left:10536;top:172;width:5;height:5;visibility:visible;mso-wrap-style:square;v-text-anchor:middle" o:gfxdata="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" fillcolor="#a1a1a1" stroked="f">
-                    <v:textbox inset="2.53958mm,2.53958mm,2.53958mm,2.53958mm">
-                      <w:txbxContent>
-                        <w:p>
-                          <w:pPr>
-                            <w:textDirection w:val="btLr"/>
-                          </w:pPr>
-                        </w:p>
-                      </w:txbxContent>
-                    </v:textbox>
-                  </v:rect>
-                  <v:rect id="Rectángulo 1285446095" o:spid="_x0000_s1035" style="position:absolute;left:1701;top:176;width:5;height:22;visibility:visible;mso-wrap-style:square;v-text-anchor:middle" o:gfxdata="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" fillcolor="#a1a1a1" stroked="f">
-                    <v:textbox inset="2.53958mm,2.53958mm,2.53958mm,2.53958mm">
-                      <w:txbxContent>
-                        <w:p>
-                          <w:pPr>
-                            <w:textDirection w:val="btLr"/>
-                          </w:pPr>
-                        </w:p>
-                      </w:txbxContent>
-                    </v:textbox>
-                  </v:rect>
-                  <v:rect id="Rectángulo 1506717558" o:spid="_x0000_s1036" style="position:absolute;left:10536;top:176;width:5;height:22;visibility:visible;mso-wrap-style:square;v-text-anchor:middle" o:gfxdata="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" fillcolor="#e4e4e4" stroked="f">
-                    <v:textbox inset="2.53958mm,2.53958mm,2.53958mm,2.53958mm">
-                      <w:txbxContent>
-                        <w:p>
-                          <w:pPr>
-                            <w:textDirection w:val="btLr"/>
-                          </w:pPr>
-                        </w:p>
-                      </w:txbxContent>
-                    </v:textbox>
-                  </v:rect>
-                  <v:rect id="Rectángulo 993780408" o:spid="_x0000_s1037" style="position:absolute;left:1701;top:198;width:5;height:5;visibility:visible;mso-wrap-style:square;v-text-anchor:middle" o:gfxdata="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" fillcolor="#a1a1a1" stroked="f">
-                    <v:textbox inset="2.53958mm,2.53958mm,2.53958mm,2.53958mm">
-                      <w:txbxContent>
-                        <w:p>
-                          <w:pPr>
-                            <w:textDirection w:val="btLr"/>
-                          </w:pPr>
-                        </w:p>
-                      </w:txbxContent>
-                    </v:textbox>
-                  </v:rect>
-                  <v:rect id="Rectángulo 189920376" o:spid="_x0000_s1038" style="position:absolute;left:1701;top:198;width:5;height:5;visibility:visible;mso-wrap-style:square;v-text-anchor:middle" o:gfxdata="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" fillcolor="#e4e4e4" stroked="f">
-                    <v:textbox inset="2.53958mm,2.53958mm,2.53958mm,2.53958mm">
-                      <w:txbxContent>
-                        <w:p>
-                          <w:pPr>
-                            <w:textDirection w:val="btLr"/>
-                          </w:pPr>
-                        </w:p>
-                      </w:txbxContent>
-                    </v:textbox>
-                  </v:rect>
-                  <v:shape id="Conector recto de flecha 20510125" o:spid="_x0000_s1039" type="#_x0000_t32" style="position:absolute;left:1706;top:201;width:8830;height:0;visibility:visible;mso-wrap-style:square" o:connectortype="straight" o:gfxdata="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" strokecolor="#e4e4e4"/>
-                  <v:rect id="Rectángulo 1073318968" o:spid="_x0000_s1040" style="position:absolute;left:10536;top:198;width:5;height:5;visibility:visible;mso-wrap-style:square;v-text-anchor:middle" o:gfxdata="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" fillcolor="#e4e4e4" stroked="f">
-                    <v:textbox inset="2.53958mm,2.53958mm,2.53958mm,2.53958mm">
-                      <w:txbxContent>
-                        <w:p>
-                          <w:pPr>
-                            <w:textDirection w:val="btLr"/>
-                          </w:pPr>
-                        </w:p>
-                      </w:txbxContent>
-                    </v:textbox>
-                  </v:rect>
-                  <v:rect id="Rectángulo 1672203367" o:spid="_x0000_s1041" style="position:absolute;left:10536;top:198;width:5;height:5;visibility:visible;mso-wrap-style:square;v-text-anchor:middle" o:gfxdata="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" fillcolor="#e4e4e4" stroked="f">
-                    <v:textbox inset="2.53958mm,2.53958mm,2.53958mm,2.53958mm">
-                      <w:txbxContent>
-                        <w:p>
-                          <w:pPr>
-                            <w:textDirection w:val="btLr"/>
-                          </w:pPr>
-                        </w:p>
-                      </w:txbxContent>
-                    </v:textbox>
-                  </v:rect>
-                </v:group>
-                <w10:wrap type="topAndBottom"/>
-              </v:group>
-            </w:pict>
+          <mc:Fallback xmlns:cr="http://schemas.microsoft.com/office/comments/2020/reactions" xmlns="http://schemas.microsoft.com/office/tasks/2019/documenttasks" xmlns:dgm="http://schemas.openxmlformats.org/drawingml/2006/diagram" xmlns:lc="http://schemas.openxmlformats.org/drawingml/2006/lockedCanvas" xmlns:c="http://schemas.openxmlformats.org/drawingml/2006/chart" xmlns:pic="http://schemas.openxmlformats.org/drawingml/2006/picture" xmlns:a="http://schemas.openxmlformats.org/drawingml/2006/main" xmlns:sl="http://schemas.openxmlformats.org/schemaLibrary/2006/main">
+            <w:drawing>
+              <wp:anchor allowOverlap="1" behindDoc="0" distB="0" distT="0" distL="0" distR="0" hidden="0" layoutInCell="1" locked="0" relativeHeight="0" simplePos="0">
+                <wp:simplePos x="0" y="0"/>
+                <wp:positionH relativeFrom="column">
+                  <wp:posOffset>152400</wp:posOffset>
+                </wp:positionH>
+                <wp:positionV relativeFrom="paragraph">
+                  <wp:posOffset>101600</wp:posOffset>
+                </wp:positionV>
+                <wp:extent cx="5613400" cy="20320"/>
+                <wp:effectExtent b="0" l="0" r="0" t="0"/>
+                <wp:wrapTopAndBottom distB="0" distT="0"/>
+                <wp:docPr id="1" name="image4.png"/>
+                <a:graphic>
+                  <a:graphicData uri="http://schemas.openxmlformats.org/drawingml/2006/picture">
+                    <pic:pic>
+                      <pic:nvPicPr>
+                        <pic:cNvPr id="0" name="image4.png"/>
+                        <pic:cNvPicPr preferRelativeResize="0"/>
+                      </pic:nvPicPr>
+                      <pic:blipFill>
+                        <a:blip r:embed="rId6"/>
+                        <a:srcRect/>
+                        <a:stretch>
+                          <a:fillRect/>
+                        </a:stretch>
+                      </pic:blipFill>
+                      <pic:spPr>
+                        <a:xfrm>
+                          <a:off x="0" y="0"/>
+                          <a:ext cx="5613400" cy="20320"/>
+                        </a:xfrm>
+                        <a:prstGeom prst="rect"/>
+                        <a:ln/>
+                      </pic:spPr>
+                    </pic:pic>
+                  </a:graphicData>
+                </a:graphic>
+              </wp:anchor>
+            </w:drawing>
           </mc:Fallback>
         </mc:AlternateContent>
       </w:r>
@@ -1007,16 +951,29 @@
                 <w:szCs w:val="16"/>
               </w:rPr>
             </w:pPr>
-            <w:r>
-              <w:rPr>
-                <w:rFonts w:ascii="Arial" w:eastAsia="Arial" w:hAnsi="Arial" w:cs="Arial"/>
-                <w:b/>
-                <w:bCs/>
-                <w:color w:val="000000"/>
-                <w:sz w:val="16"/>
-                <w:szCs w:val="16"/>
-              </w:rPr>
-              <w:t>ii.</w:t>
+            <w:proofErr w:type="spellStart"/>
+            <w:r>
+              <w:rPr>
+                <w:rFonts w:ascii="Arial" w:eastAsia="Arial" w:hAnsi="Arial" w:cs="Arial"/>
+                <w:b/>
+                <w:bCs/>
+                <w:color w:val="000000"/>
+                <w:sz w:val="16"/>
+                <w:szCs w:val="16"/>
+              </w:rPr>
+              <w:t>ii</w:t>
+            </w:r>
+            <w:proofErr w:type="spellEnd"/>
+            <w:r>
+              <w:rPr>
+                <w:rFonts w:ascii="Arial" w:eastAsia="Arial" w:hAnsi="Arial" w:cs="Arial"/>
+                <w:b/>
+                <w:bCs/>
+                <w:color w:val="000000"/>
+                <w:sz w:val="16"/>
+                <w:szCs w:val="16"/>
+              </w:rPr>
+              <w:t>.</w:t>
             </w:r>
             <w:r>
               <w:rPr>
@@ -1028,8 +985,21 @@
                 <w:szCs w:val="16"/>
               </w:rPr>
               <w:tab/>
-              <w:t>CUIT N°</w:t>
-            </w:r>
+              <w:t xml:space="preserve">CUIT </w:t>
+            </w:r>
+            <w:proofErr w:type="spellStart"/>
+            <w:r>
+              <w:rPr>
+                <w:rFonts w:ascii="Arial" w:eastAsia="Arial" w:hAnsi="Arial" w:cs="Arial"/>
+                <w:b/>
+                <w:bCs/>
+                <w:color w:val="000000"/>
+                <w:sz w:val="16"/>
+                <w:szCs w:val="16"/>
+              </w:rPr>
+              <w:t>N°</w:t>
+            </w:r>
+            <w:proofErr w:type="spellEnd"/>
           </w:p>
         </w:tc>
         <w:tc>
@@ -1099,16 +1069,29 @@
                 <w:szCs w:val="16"/>
               </w:rPr>
             </w:pPr>
-            <w:r>
-              <w:rPr>
-                <w:rFonts w:ascii="Arial" w:eastAsia="Arial" w:hAnsi="Arial" w:cs="Arial"/>
-                <w:b/>
-                <w:bCs/>
-                <w:color w:val="000000"/>
-                <w:sz w:val="16"/>
-                <w:szCs w:val="16"/>
-              </w:rPr>
-              <w:t>iii.</w:t>
+            <w:proofErr w:type="spellStart"/>
+            <w:r>
+              <w:rPr>
+                <w:rFonts w:ascii="Arial" w:eastAsia="Arial" w:hAnsi="Arial" w:cs="Arial"/>
+                <w:b/>
+                <w:bCs/>
+                <w:color w:val="000000"/>
+                <w:sz w:val="16"/>
+                <w:szCs w:val="16"/>
+              </w:rPr>
+              <w:t>iii</w:t>
+            </w:r>
+            <w:proofErr w:type="spellEnd"/>
+            <w:r>
+              <w:rPr>
+                <w:rFonts w:ascii="Arial" w:eastAsia="Arial" w:hAnsi="Arial" w:cs="Arial"/>
+                <w:b/>
+                <w:bCs/>
+                <w:color w:val="000000"/>
+                <w:sz w:val="16"/>
+                <w:szCs w:val="16"/>
+              </w:rPr>
+              <w:t>.</w:t>
             </w:r>
             <w:r>
               <w:rPr>
@@ -1191,16 +1174,29 @@
                 <w:szCs w:val="16"/>
               </w:rPr>
             </w:pPr>
-            <w:r>
-              <w:rPr>
-                <w:rFonts w:ascii="Arial" w:eastAsia="Arial" w:hAnsi="Arial" w:cs="Arial"/>
-                <w:b/>
-                <w:bCs/>
-                <w:color w:val="000000"/>
-                <w:sz w:val="16"/>
-                <w:szCs w:val="16"/>
-              </w:rPr>
-              <w:t>iv.</w:t>
+            <w:proofErr w:type="spellStart"/>
+            <w:r>
+              <w:rPr>
+                <w:rFonts w:ascii="Arial" w:eastAsia="Arial" w:hAnsi="Arial" w:cs="Arial"/>
+                <w:b/>
+                <w:bCs/>
+                <w:color w:val="000000"/>
+                <w:sz w:val="16"/>
+                <w:szCs w:val="16"/>
+              </w:rPr>
+              <w:t>iv</w:t>
+            </w:r>
+            <w:proofErr w:type="spellEnd"/>
+            <w:r>
+              <w:rPr>
+                <w:rFonts w:ascii="Arial" w:eastAsia="Arial" w:hAnsi="Arial" w:cs="Arial"/>
+                <w:b/>
+                <w:bCs/>
+                <w:color w:val="000000"/>
+                <w:sz w:val="16"/>
+                <w:szCs w:val="16"/>
+              </w:rPr>
+              <w:t>.</w:t>
             </w:r>
             <w:r>
               <w:rPr>
@@ -1499,16 +1495,29 @@
                 <w:szCs w:val="16"/>
               </w:rPr>
             </w:pPr>
-            <w:r>
-              <w:rPr>
-                <w:rFonts w:ascii="Arial" w:eastAsia="Arial" w:hAnsi="Arial" w:cs="Arial"/>
-                <w:b/>
-                <w:bCs/>
-                <w:color w:val="000000"/>
-                <w:sz w:val="16"/>
-                <w:szCs w:val="16"/>
-              </w:rPr>
-              <w:t>vii.</w:t>
+            <w:proofErr w:type="spellStart"/>
+            <w:r>
+              <w:rPr>
+                <w:rFonts w:ascii="Arial" w:eastAsia="Arial" w:hAnsi="Arial" w:cs="Arial"/>
+                <w:b/>
+                <w:bCs/>
+                <w:color w:val="000000"/>
+                <w:sz w:val="16"/>
+                <w:szCs w:val="16"/>
+              </w:rPr>
+              <w:t>vii</w:t>
+            </w:r>
+            <w:proofErr w:type="spellEnd"/>
+            <w:r>
+              <w:rPr>
+                <w:rFonts w:ascii="Arial" w:eastAsia="Arial" w:hAnsi="Arial" w:cs="Arial"/>
+                <w:b/>
+                <w:bCs/>
+                <w:color w:val="000000"/>
+                <w:sz w:val="16"/>
+                <w:szCs w:val="16"/>
+              </w:rPr>
+              <w:t>.</w:t>
             </w:r>
             <w:r>
               <w:rPr>
@@ -1673,16 +1682,29 @@
                 <w:szCs w:val="16"/>
               </w:rPr>
             </w:pPr>
-            <w:r>
-              <w:rPr>
-                <w:rFonts w:ascii="Arial" w:eastAsia="Arial" w:hAnsi="Arial" w:cs="Arial"/>
-                <w:b/>
-                <w:bCs/>
-                <w:color w:val="000000"/>
-                <w:sz w:val="16"/>
-                <w:szCs w:val="16"/>
-              </w:rPr>
-              <w:t>viii.</w:t>
+            <w:proofErr w:type="spellStart"/>
+            <w:r>
+              <w:rPr>
+                <w:rFonts w:ascii="Arial" w:eastAsia="Arial" w:hAnsi="Arial" w:cs="Arial"/>
+                <w:b/>
+                <w:bCs/>
+                <w:color w:val="000000"/>
+                <w:sz w:val="16"/>
+                <w:szCs w:val="16"/>
+              </w:rPr>
+              <w:t>viii</w:t>
+            </w:r>
+            <w:proofErr w:type="spellEnd"/>
+            <w:r>
+              <w:rPr>
+                <w:rFonts w:ascii="Arial" w:eastAsia="Arial" w:hAnsi="Arial" w:cs="Arial"/>
+                <w:b/>
+                <w:bCs/>
+                <w:color w:val="000000"/>
+                <w:sz w:val="16"/>
+                <w:szCs w:val="16"/>
+              </w:rPr>
+              <w:t>.</w:t>
             </w:r>
             <w:r>
               <w:rPr>
@@ -1764,16 +1786,29 @@
                 <w:szCs w:val="16"/>
               </w:rPr>
             </w:pPr>
-            <w:r>
-              <w:rPr>
-                <w:rFonts w:ascii="Arial" w:eastAsia="Arial" w:hAnsi="Arial" w:cs="Arial"/>
-                <w:b/>
-                <w:bCs/>
-                <w:color w:val="000000"/>
-                <w:sz w:val="16"/>
-                <w:szCs w:val="16"/>
-              </w:rPr>
-              <w:t>ix.</w:t>
+            <w:proofErr w:type="spellStart"/>
+            <w:r>
+              <w:rPr>
+                <w:rFonts w:ascii="Arial" w:eastAsia="Arial" w:hAnsi="Arial" w:cs="Arial"/>
+                <w:b/>
+                <w:bCs/>
+                <w:color w:val="000000"/>
+                <w:sz w:val="16"/>
+                <w:szCs w:val="16"/>
+              </w:rPr>
+              <w:t>ix</w:t>
+            </w:r>
+            <w:proofErr w:type="spellEnd"/>
+            <w:r>
+              <w:rPr>
+                <w:rFonts w:ascii="Arial" w:eastAsia="Arial" w:hAnsi="Arial" w:cs="Arial"/>
+                <w:b/>
+                <w:bCs/>
+                <w:color w:val="000000"/>
+                <w:sz w:val="16"/>
+                <w:szCs w:val="16"/>
+              </w:rPr>
+              <w:t>.</w:t>
             </w:r>
             <w:r>
               <w:rPr>
@@ -1785,8 +1820,21 @@
                 <w:szCs w:val="16"/>
               </w:rPr>
               <w:tab/>
-              <w:t>CUIT N°</w:t>
-            </w:r>
+              <w:t xml:space="preserve">CUIT </w:t>
+            </w:r>
+            <w:proofErr w:type="spellStart"/>
+            <w:r>
+              <w:rPr>
+                <w:rFonts w:ascii="Arial" w:eastAsia="Arial" w:hAnsi="Arial" w:cs="Arial"/>
+                <w:b/>
+                <w:bCs/>
+                <w:color w:val="000000"/>
+                <w:sz w:val="16"/>
+                <w:szCs w:val="16"/>
+              </w:rPr>
+              <w:t>N°</w:t>
+            </w:r>
+            <w:proofErr w:type="spellEnd"/>
           </w:p>
         </w:tc>
         <w:tc>
@@ -2161,16 +2209,29 @@
                 <w:szCs w:val="16"/>
               </w:rPr>
             </w:pPr>
-            <w:r>
-              <w:rPr>
-                <w:rFonts w:ascii="Arial" w:eastAsia="Arial" w:hAnsi="Arial" w:cs="Arial"/>
-                <w:b/>
-                <w:bCs/>
-                <w:color w:val="000000"/>
-                <w:sz w:val="16"/>
-                <w:szCs w:val="16"/>
-              </w:rPr>
-              <w:t>ii.</w:t>
+            <w:proofErr w:type="spellStart"/>
+            <w:r>
+              <w:rPr>
+                <w:rFonts w:ascii="Arial" w:eastAsia="Arial" w:hAnsi="Arial" w:cs="Arial"/>
+                <w:b/>
+                <w:bCs/>
+                <w:color w:val="000000"/>
+                <w:sz w:val="16"/>
+                <w:szCs w:val="16"/>
+              </w:rPr>
+              <w:t>ii</w:t>
+            </w:r>
+            <w:proofErr w:type="spellEnd"/>
+            <w:r>
+              <w:rPr>
+                <w:rFonts w:ascii="Arial" w:eastAsia="Arial" w:hAnsi="Arial" w:cs="Arial"/>
+                <w:b/>
+                <w:bCs/>
+                <w:color w:val="000000"/>
+                <w:sz w:val="16"/>
+                <w:szCs w:val="16"/>
+              </w:rPr>
+              <w:t>.</w:t>
             </w:r>
             <w:r>
               <w:rPr>
@@ -2213,7 +2274,25 @@
                 <w:sz w:val="16"/>
                 <w:szCs w:val="16"/>
               </w:rPr>
-              <w:t>Información Restringida - Res. SIyC 237/2024 (China)</w:t>
+              <w:t xml:space="preserve">Información Restringida - Res. </w:t>
+            </w:r>
+            <w:proofErr w:type="spellStart"/>
+            <w:r>
+              <w:rPr>
+                <w:rFonts w:ascii="Arial" w:eastAsia="Arial" w:hAnsi="Arial" w:cs="Arial"/>
+                <w:sz w:val="16"/>
+                <w:szCs w:val="16"/>
+              </w:rPr>
+              <w:t>SIyC</w:t>
+            </w:r>
+            <w:proofErr w:type="spellEnd"/>
+            <w:r>
+              <w:rPr>
+                <w:rFonts w:ascii="Arial" w:eastAsia="Arial" w:hAnsi="Arial" w:cs="Arial"/>
+                <w:sz w:val="16"/>
+                <w:szCs w:val="16"/>
+              </w:rPr>
+              <w:t xml:space="preserve"> 237/2024 (China)</w:t>
             </w:r>
           </w:p>
         </w:tc>
@@ -2290,7 +2369,25 @@
                 <w:sz w:val="16"/>
                 <w:szCs w:val="16"/>
               </w:rPr>
-              <w:t>Información Restringida - Res. SIyC 237/2024 (China)</w:t>
+              <w:t xml:space="preserve">Información Restringida - Res. </w:t>
+            </w:r>
+            <w:proofErr w:type="spellStart"/>
+            <w:r>
+              <w:rPr>
+                <w:rFonts w:ascii="Arial" w:eastAsia="Arial" w:hAnsi="Arial" w:cs="Arial"/>
+                <w:sz w:val="16"/>
+                <w:szCs w:val="16"/>
+              </w:rPr>
+              <w:t>SIyC</w:t>
+            </w:r>
+            <w:proofErr w:type="spellEnd"/>
+            <w:r>
+              <w:rPr>
+                <w:rFonts w:ascii="Arial" w:eastAsia="Arial" w:hAnsi="Arial" w:cs="Arial"/>
+                <w:sz w:val="16"/>
+                <w:szCs w:val="16"/>
+              </w:rPr>
+              <w:t xml:space="preserve"> 237/2024 (China)</w:t>
             </w:r>
           </w:p>
         </w:tc>
@@ -2330,16 +2427,29 @@
                 <w:szCs w:val="16"/>
               </w:rPr>
             </w:pPr>
-            <w:r>
-              <w:rPr>
-                <w:rFonts w:ascii="Arial" w:eastAsia="Arial" w:hAnsi="Arial" w:cs="Arial"/>
-                <w:b/>
-                <w:bCs/>
-                <w:color w:val="000000"/>
-                <w:sz w:val="16"/>
-                <w:szCs w:val="16"/>
-              </w:rPr>
-              <w:t>iii.</w:t>
+            <w:proofErr w:type="spellStart"/>
+            <w:r>
+              <w:rPr>
+                <w:rFonts w:ascii="Arial" w:eastAsia="Arial" w:hAnsi="Arial" w:cs="Arial"/>
+                <w:b/>
+                <w:bCs/>
+                <w:color w:val="000000"/>
+                <w:sz w:val="16"/>
+                <w:szCs w:val="16"/>
+              </w:rPr>
+              <w:t>iii</w:t>
+            </w:r>
+            <w:proofErr w:type="spellEnd"/>
+            <w:r>
+              <w:rPr>
+                <w:rFonts w:ascii="Arial" w:eastAsia="Arial" w:hAnsi="Arial" w:cs="Arial"/>
+                <w:b/>
+                <w:bCs/>
+                <w:color w:val="000000"/>
+                <w:sz w:val="16"/>
+                <w:szCs w:val="16"/>
+              </w:rPr>
+              <w:t>.</w:t>
             </w:r>
             <w:r>
               <w:rPr>
@@ -2376,14 +2486,6 @@
                 <w:szCs w:val="16"/>
               </w:rPr>
             </w:pPr>
-            <w:r>
-              <w:rPr>
-                <w:rFonts w:ascii="Arial" w:eastAsia="Arial" w:hAnsi="Arial" w:cs="Arial"/>
-                <w:sz w:val="16"/>
-                <w:szCs w:val="16"/>
-              </w:rPr>
-              <w:t>Lavavajillas eléctrico</w:t>
-            </w:r>
           </w:p>
         </w:tc>
       </w:tr>
@@ -2453,14 +2555,6 @@
                 <w:szCs w:val="16"/>
               </w:rPr>
             </w:pPr>
-            <w:r>
-              <w:rPr>
-                <w:rFonts w:ascii="Arial" w:eastAsia="Arial" w:hAnsi="Arial" w:cs="Arial"/>
-                <w:sz w:val="16"/>
-                <w:szCs w:val="16"/>
-              </w:rPr>
-              <w:t>GADNIC</w:t>
-            </w:r>
           </w:p>
         </w:tc>
       </w:tr>
@@ -2529,14 +2623,6 @@
                 <w:szCs w:val="16"/>
               </w:rPr>
             </w:pPr>
-            <w:r>
-              <w:rPr>
-                <w:rFonts w:ascii="Arial" w:eastAsia="Arial" w:hAnsi="Arial" w:cs="Arial"/>
-                <w:sz w:val="16"/>
-                <w:szCs w:val="16"/>
-              </w:rPr>
-              <w:t xml:space="preserve">  GADW10</w:t>
-            </w:r>
           </w:p>
         </w:tc>
       </w:tr>
@@ -2596,226 +2682,6 @@
             </w:tcBorders>
             <w:vAlign w:val="center"/>
           </w:tcPr>
-          <w:p>
-            <w:pPr>
-              <w:spacing w:line="265" w:lineRule="auto"/>
-              <w:ind w:left="107"/>
-              <w:rPr>
-                <w:rFonts w:ascii="Arial" w:eastAsia="Arial" w:hAnsi="Arial" w:cs="Arial"/>
-                <w:sz w:val="16"/>
-                <w:szCs w:val="16"/>
-              </w:rPr>
-            </w:pPr>
-            <w:r>
-              <w:rPr>
-                <w:rFonts w:ascii="Arial" w:eastAsia="Arial" w:hAnsi="Arial" w:cs="Arial"/>
-                <w:sz w:val="16"/>
-                <w:szCs w:val="16"/>
-              </w:rPr>
-              <w:t>220-240 V~; 50 Hz; 1700-2040 W; Clase I; IPX1</w:t>
-            </w:r>
-          </w:p>
-          <w:p>
-            <w:pPr>
-              <w:spacing w:line="276" w:lineRule="auto"/>
-              <w:ind w:left="107"/>
-              <w:rPr>
-                <w:rFonts w:ascii="Arial" w:eastAsia="Arial" w:hAnsi="Arial" w:cs="Arial"/>
-                <w:sz w:val="16"/>
-                <w:szCs w:val="16"/>
-              </w:rPr>
-            </w:pPr>
-            <w:r>
-              <w:rPr>
-                <w:rFonts w:ascii="Arial" w:eastAsia="Arial" w:hAnsi="Arial" w:cs="Arial"/>
-                <w:b/>
-                <w:bCs/>
-                <w:sz w:val="16"/>
-                <w:szCs w:val="16"/>
-              </w:rPr>
-              <w:t xml:space="preserve">Clase de eficiencia energética: </w:t>
-            </w:r>
-            <w:r>
-              <w:rPr>
-                <w:rFonts w:ascii="Arial" w:eastAsia="Arial" w:hAnsi="Arial" w:cs="Arial"/>
-                <w:sz w:val="16"/>
-                <w:szCs w:val="16"/>
-              </w:rPr>
-              <w:t>A</w:t>
-            </w:r>
-          </w:p>
-          <w:p>
-            <w:pPr>
-              <w:spacing w:line="276" w:lineRule="auto"/>
-              <w:ind w:left="107"/>
-              <w:rPr>
-                <w:rFonts w:ascii="Arial" w:eastAsia="Arial" w:hAnsi="Arial" w:cs="Arial"/>
-                <w:sz w:val="16"/>
-                <w:szCs w:val="16"/>
-              </w:rPr>
-            </w:pPr>
-            <w:r>
-              <w:rPr>
-                <w:rFonts w:ascii="Arial" w:eastAsia="Arial" w:hAnsi="Arial" w:cs="Arial"/>
-                <w:b/>
-                <w:bCs/>
-                <w:sz w:val="16"/>
-                <w:szCs w:val="16"/>
-              </w:rPr>
-              <w:t xml:space="preserve">Consumo de energía por ciclo: </w:t>
-            </w:r>
-            <w:r>
-              <w:rPr>
-                <w:rFonts w:ascii="Arial" w:eastAsia="Arial" w:hAnsi="Arial" w:cs="Arial"/>
-                <w:sz w:val="16"/>
-                <w:szCs w:val="16"/>
-              </w:rPr>
-              <w:t>0,65</w:t>
-            </w:r>
-          </w:p>
-          <w:p>
-            <w:pPr>
-              <w:spacing w:line="276" w:lineRule="auto"/>
-              <w:ind w:left="107"/>
-              <w:rPr>
-                <w:rFonts w:ascii="Arial" w:eastAsia="Arial" w:hAnsi="Arial" w:cs="Arial"/>
-                <w:sz w:val="16"/>
-                <w:szCs w:val="16"/>
-              </w:rPr>
-            </w:pPr>
-            <w:r>
-              <w:rPr>
-                <w:rFonts w:ascii="Arial" w:eastAsia="Arial" w:hAnsi="Arial" w:cs="Arial"/>
-                <w:b/>
-                <w:bCs/>
-                <w:sz w:val="16"/>
-                <w:szCs w:val="16"/>
-              </w:rPr>
-              <w:t>Consumo de agua por ciclo:</w:t>
-            </w:r>
-            <w:r>
-              <w:rPr>
-                <w:rFonts w:ascii="Arial" w:eastAsia="Arial" w:hAnsi="Arial" w:cs="Arial"/>
-                <w:sz w:val="16"/>
-                <w:szCs w:val="16"/>
-              </w:rPr>
-              <w:t xml:space="preserve"> 9 Litros</w:t>
-            </w:r>
-          </w:p>
-          <w:p>
-            <w:pPr>
-              <w:spacing w:line="276" w:lineRule="auto"/>
-              <w:ind w:left="107"/>
-              <w:rPr>
-                <w:rFonts w:ascii="Arial" w:eastAsia="Arial" w:hAnsi="Arial" w:cs="Arial"/>
-                <w:sz w:val="16"/>
-                <w:szCs w:val="16"/>
-              </w:rPr>
-            </w:pPr>
-            <w:r>
-              <w:rPr>
-                <w:rFonts w:ascii="Arial" w:eastAsia="Arial" w:hAnsi="Arial" w:cs="Arial"/>
-                <w:b/>
-                <w:bCs/>
-                <w:sz w:val="16"/>
-                <w:szCs w:val="16"/>
-              </w:rPr>
-              <w:t>Eficacia de secado: A</w:t>
-            </w:r>
-          </w:p>
-          <w:p>
-            <w:pPr>
-              <w:spacing w:line="276" w:lineRule="auto"/>
-              <w:ind w:left="107"/>
-              <w:rPr>
-                <w:rFonts w:ascii="Arial" w:eastAsia="Arial" w:hAnsi="Arial" w:cs="Arial"/>
-                <w:b/>
-                <w:bCs/>
-                <w:sz w:val="16"/>
-                <w:szCs w:val="16"/>
-              </w:rPr>
-            </w:pPr>
-            <w:r>
-              <w:rPr>
-                <w:rFonts w:ascii="Arial" w:eastAsia="Arial" w:hAnsi="Arial" w:cs="Arial"/>
-                <w:b/>
-                <w:bCs/>
-                <w:sz w:val="16"/>
-                <w:szCs w:val="16"/>
-              </w:rPr>
-              <w:t>Capacidad declarada 10 cubiertos</w:t>
-            </w:r>
-          </w:p>
-          <w:p>
-            <w:pPr>
-              <w:spacing w:line="276" w:lineRule="auto"/>
-              <w:ind w:left="107"/>
-              <w:rPr>
-                <w:rFonts w:ascii="Arial" w:eastAsia="Arial" w:hAnsi="Arial" w:cs="Arial"/>
-                <w:b/>
-                <w:bCs/>
-                <w:sz w:val="16"/>
-                <w:szCs w:val="16"/>
-              </w:rPr>
-            </w:pPr>
-            <w:r>
-              <w:rPr>
-                <w:rFonts w:ascii="Arial" w:eastAsia="Arial" w:hAnsi="Arial" w:cs="Arial"/>
-                <w:b/>
-                <w:bCs/>
-                <w:sz w:val="16"/>
-                <w:szCs w:val="16"/>
-              </w:rPr>
-              <w:t xml:space="preserve">Nivel de ruido: </w:t>
-            </w:r>
-            <w:r>
-              <w:rPr>
-                <w:rFonts w:ascii="Arial" w:eastAsia="Arial" w:hAnsi="Arial" w:cs="Arial"/>
-                <w:sz w:val="16"/>
-                <w:szCs w:val="16"/>
-              </w:rPr>
-              <w:t>49 dB(A) re 1 pW</w:t>
-            </w:r>
-            <w:r>
-              <w:rPr>
-                <w:rFonts w:ascii="Arial" w:eastAsia="Arial" w:hAnsi="Arial" w:cs="Arial"/>
-                <w:b/>
-                <w:bCs/>
-                <w:sz w:val="16"/>
-                <w:szCs w:val="16"/>
-              </w:rPr>
-              <w:t xml:space="preserve"> </w:t>
-            </w:r>
-          </w:p>
-          <w:p>
-            <w:pPr>
-              <w:spacing w:line="276" w:lineRule="auto"/>
-              <w:ind w:left="107"/>
-              <w:rPr>
-                <w:rFonts w:ascii="Arial" w:eastAsia="Arial" w:hAnsi="Arial" w:cs="Arial"/>
-                <w:sz w:val="16"/>
-                <w:szCs w:val="16"/>
-              </w:rPr>
-            </w:pPr>
-            <w:r>
-              <w:rPr>
-                <w:rFonts w:ascii="Arial" w:eastAsia="Arial" w:hAnsi="Arial" w:cs="Arial"/>
-                <w:b/>
-                <w:bCs/>
-                <w:sz w:val="16"/>
-                <w:szCs w:val="16"/>
-              </w:rPr>
-              <w:t xml:space="preserve">Consumo eléctrico en modo de espera (W): </w:t>
-            </w:r>
-            <w:r>
-              <w:rPr>
-                <w:rFonts w:ascii="Arial" w:eastAsia="Arial" w:hAnsi="Arial" w:cs="Arial"/>
-                <w:sz w:val="16"/>
-                <w:szCs w:val="16"/>
-              </w:rPr>
-              <w:t>0,28 W</w:t>
-            </w:r>
-          </w:p>
           <w:p>
             <w:pPr>
               <w:spacing w:line="276" w:lineRule="auto"/>
@@ -2840,10 +2706,10 @@
           <w:szCs w:val="16"/>
         </w:rPr>
         <w:sectPr>
-          <w:headerReference w:type="default" r:id="rId6"/>
-          <w:footerReference w:type="default" r:id="rId7"/>
-          <w:headerReference w:type="first" r:id="rId8"/>
-          <w:footerReference w:type="first" r:id="rId9"/>
+          <w:headerReference w:type="default" r:id="rId7"/>
+          <w:footerReference w:type="default" r:id="rId8"/>
+          <w:headerReference w:type="first" r:id="rId9"/>
+          <w:footerReference w:type="first" r:id="rId10"/>
           <w:pgSz w:w="12240" w:h="15840"/>
           <w:pgMar w:top="1275" w:right="1540" w:bottom="1200" w:left="1460" w:header="324" w:footer="1005" w:gutter="0"/>
           <w:pgNumType w:start="1"/>
@@ -2918,7 +2784,7 @@
       <w:tblPr>
         <w:tblStyle w:val="a3"/>
         <w:tblW w:w="9780" w:type="dxa"/>
-        <w:tblInd w:w="113" w:type="dxa"/>
+        <w:tblInd w:w="138" w:type="dxa"/>
         <w:tblBorders>
           <w:top w:val="single" w:sz="4" w:space="0" w:color="000000"/>
           <w:left w:val="single" w:sz="4" w:space="0" w:color="000000"/>
@@ -3029,16 +2895,6 @@
                 <w:szCs w:val="16"/>
               </w:rPr>
             </w:pPr>
-            <w:r>
-              <w:rPr>
-                <w:rFonts w:ascii="Arial" w:eastAsia="Arial" w:hAnsi="Arial" w:cs="Arial"/>
-                <w:color w:val="000000"/>
-                <w:sz w:val="16"/>
-                <w:szCs w:val="16"/>
-                <w:shd w:val="clear" w:color="auto" w:fill="E8EAED"/>
-              </w:rPr>
-              <w:t>Resolución 438/2024 (Eficiencia Energetica)</w:t>
-            </w:r>
           </w:p>
         </w:tc>
       </w:tr>
@@ -3080,16 +2936,29 @@
                 <w:szCs w:val="16"/>
               </w:rPr>
             </w:pPr>
-            <w:r>
-              <w:rPr>
-                <w:rFonts w:ascii="Arial" w:eastAsia="Arial" w:hAnsi="Arial" w:cs="Arial"/>
-                <w:b/>
-                <w:bCs/>
-                <w:color w:val="000000"/>
-                <w:sz w:val="16"/>
-                <w:szCs w:val="16"/>
-              </w:rPr>
-              <w:t>ii.</w:t>
+            <w:proofErr w:type="spellStart"/>
+            <w:r>
+              <w:rPr>
+                <w:rFonts w:ascii="Arial" w:eastAsia="Arial" w:hAnsi="Arial" w:cs="Arial"/>
+                <w:b/>
+                <w:bCs/>
+                <w:color w:val="000000"/>
+                <w:sz w:val="16"/>
+                <w:szCs w:val="16"/>
+              </w:rPr>
+              <w:t>ii</w:t>
+            </w:r>
+            <w:proofErr w:type="spellEnd"/>
+            <w:r>
+              <w:rPr>
+                <w:rFonts w:ascii="Arial" w:eastAsia="Arial" w:hAnsi="Arial" w:cs="Arial"/>
+                <w:b/>
+                <w:bCs/>
+                <w:color w:val="000000"/>
+                <w:sz w:val="16"/>
+                <w:szCs w:val="16"/>
+              </w:rPr>
+              <w:t>.</w:t>
             </w:r>
             <w:r>
               <w:rPr>
@@ -3132,16 +3001,9 @@
                 <w:rFonts w:ascii="Arial" w:eastAsia="Arial" w:hAnsi="Arial" w:cs="Arial"/>
                 <w:sz w:val="16"/>
                 <w:szCs w:val="16"/>
-              </w:rPr>
-            </w:pPr>
-            <w:r>
-              <w:rPr>
-                <w:rFonts w:ascii="Arial" w:eastAsia="Arial" w:hAnsi="Arial" w:cs="Arial"/>
-                <w:sz w:val="16"/>
-                <w:szCs w:val="16"/>
-              </w:rPr>
-              <w:t xml:space="preserve">IRAM 2294-3:2016 IEC 60436:2015, Edition 4.0 IEC 60704-1:2010 IEC 60704-2-3:2017 IRAM 62301:2012 </w:t>
-            </w:r>
+                <w:lang w:val="en-US"/>
+              </w:rPr>
+            </w:pPr>
           </w:p>
         </w:tc>
       </w:tr>
@@ -3182,16 +3044,29 @@
                 <w:szCs w:val="16"/>
               </w:rPr>
             </w:pPr>
-            <w:r>
-              <w:rPr>
-                <w:rFonts w:ascii="Arial" w:eastAsia="Arial" w:hAnsi="Arial" w:cs="Arial"/>
-                <w:b/>
-                <w:bCs/>
-                <w:color w:val="000000"/>
-                <w:sz w:val="16"/>
-                <w:szCs w:val="16"/>
-              </w:rPr>
-              <w:t>iii.</w:t>
+            <w:proofErr w:type="spellStart"/>
+            <w:r>
+              <w:rPr>
+                <w:rFonts w:ascii="Arial" w:eastAsia="Arial" w:hAnsi="Arial" w:cs="Arial"/>
+                <w:b/>
+                <w:bCs/>
+                <w:color w:val="000000"/>
+                <w:sz w:val="16"/>
+                <w:szCs w:val="16"/>
+              </w:rPr>
+              <w:t>iii</w:t>
+            </w:r>
+            <w:proofErr w:type="spellEnd"/>
+            <w:r>
+              <w:rPr>
+                <w:rFonts w:ascii="Arial" w:eastAsia="Arial" w:hAnsi="Arial" w:cs="Arial"/>
+                <w:b/>
+                <w:bCs/>
+                <w:color w:val="000000"/>
+                <w:sz w:val="16"/>
+                <w:szCs w:val="16"/>
+              </w:rPr>
+              <w:t>.</w:t>
             </w:r>
             <w:r>
               <w:rPr>
@@ -3268,14 +3143,25 @@
                 <w:szCs w:val="16"/>
               </w:rPr>
             </w:pPr>
-            <w:r>
-              <w:rPr>
-                <w:rFonts w:ascii="Arial" w:eastAsia="Arial" w:hAnsi="Arial" w:cs="Arial"/>
-                <w:color w:val="000000"/>
-                <w:sz w:val="16"/>
-                <w:szCs w:val="16"/>
-              </w:rPr>
-              <w:t xml:space="preserve">N° </w:t>
+            <w:proofErr w:type="spellStart"/>
+            <w:r>
+              <w:rPr>
+                <w:rFonts w:ascii="Arial" w:eastAsia="Arial" w:hAnsi="Arial" w:cs="Arial"/>
+                <w:color w:val="000000"/>
+                <w:sz w:val="16"/>
+                <w:szCs w:val="16"/>
+              </w:rPr>
+              <w:t>N°</w:t>
+            </w:r>
+            <w:proofErr w:type="spellEnd"/>
+            <w:r>
+              <w:rPr>
+                <w:rFonts w:ascii="Arial" w:eastAsia="Arial" w:hAnsi="Arial" w:cs="Arial"/>
+                <w:color w:val="000000"/>
+                <w:sz w:val="16"/>
+                <w:szCs w:val="16"/>
+              </w:rPr>
+              <w:t xml:space="preserve"> </w:t>
             </w:r>
             <w:r>
               <w:rPr>
@@ -3316,14 +3202,6 @@
                 <w:szCs w:val="16"/>
               </w:rPr>
             </w:pPr>
-            <w:r>
-              <w:rPr>
-                <w:rFonts w:ascii="Arial" w:eastAsia="Arial" w:hAnsi="Arial" w:cs="Arial"/>
-                <w:sz w:val="16"/>
-                <w:szCs w:val="16"/>
-              </w:rPr>
-              <w:t xml:space="preserve">CN26BARV 001 </w:t>
-            </w:r>
           </w:p>
         </w:tc>
       </w:tr>
@@ -3469,16 +3347,6 @@
                 <w:szCs w:val="16"/>
               </w:rPr>
             </w:pPr>
-            <w:r>
-              <w:rPr>
-                <w:rFonts w:ascii="Arial" w:eastAsia="Arial" w:hAnsi="Arial" w:cs="Arial"/>
-                <w:color w:val="000000"/>
-                <w:sz w:val="16"/>
-                <w:szCs w:val="16"/>
-                <w:shd w:val="clear" w:color="auto" w:fill="E8EAED"/>
-              </w:rPr>
-              <w:t>Eficiencia Energética</w:t>
-            </w:r>
           </w:p>
         </w:tc>
       </w:tr>
@@ -3583,14 +3451,6 @@
                 <w:szCs w:val="16"/>
               </w:rPr>
             </w:pPr>
-            <w:r>
-              <w:rPr>
-                <w:rFonts w:ascii="Arial" w:eastAsia="Arial" w:hAnsi="Arial" w:cs="Arial"/>
-                <w:sz w:val="16"/>
-                <w:szCs w:val="16"/>
-              </w:rPr>
-              <w:t>10/03/2026</w:t>
-            </w:r>
           </w:p>
         </w:tc>
       </w:tr>
@@ -3712,14 +3572,6 @@
                 <w:szCs w:val="16"/>
               </w:rPr>
             </w:pPr>
-            <w:r>
-              <w:rPr>
-                <w:rFonts w:ascii="Arial" w:eastAsia="Arial" w:hAnsi="Arial" w:cs="Arial"/>
-                <w:sz w:val="16"/>
-                <w:szCs w:val="16"/>
-              </w:rPr>
-              <w:t>No aplicable</w:t>
-            </w:r>
           </w:p>
         </w:tc>
       </w:tr>
@@ -3841,14 +3693,6 @@
                 <w:szCs w:val="16"/>
               </w:rPr>
             </w:pPr>
-            <w:r>
-              <w:rPr>
-                <w:rFonts w:ascii="Arial" w:eastAsia="Arial" w:hAnsi="Arial" w:cs="Arial"/>
-                <w:sz w:val="16"/>
-                <w:szCs w:val="16"/>
-              </w:rPr>
-              <w:t>10/03/2030</w:t>
-            </w:r>
           </w:p>
         </w:tc>
       </w:tr>
@@ -3936,22 +3780,22 @@
           </w:tcPr>
           <w:p>
             <w:pPr>
-              <w:rPr>
-                <w:rFonts w:ascii="Arial" w:eastAsia="Arial" w:hAnsi="Arial" w:cs="Arial"/>
-                <w:color w:val="000000"/>
-                <w:sz w:val="16"/>
-                <w:szCs w:val="16"/>
-              </w:rPr>
-            </w:pPr>
-            <w:r>
-              <w:rPr>
-                <w:rFonts w:ascii="Arial" w:eastAsia="Arial" w:hAnsi="Arial" w:cs="Arial"/>
-                <w:color w:val="000000"/>
-                <w:sz w:val="16"/>
-                <w:szCs w:val="16"/>
-              </w:rPr>
-              <w:t>TÜV Rheinland (Guangdong) Ltd.</w:t>
-            </w:r>
+              <w:pBdr>
+                <w:top w:val="nil"/>
+                <w:left w:val="nil"/>
+                <w:bottom w:val="nil"/>
+                <w:right w:val="nil"/>
+                <w:between w:val="nil"/>
+              </w:pBdr>
+              <w:spacing w:line="252" w:lineRule="auto"/>
+              <w:ind w:left="107"/>
+              <w:rPr>
+                <w:rFonts w:ascii="Arial" w:eastAsia="Arial" w:hAnsi="Arial" w:cs="Arial"/>
+                <w:color w:val="000000"/>
+                <w:sz w:val="16"/>
+                <w:szCs w:val="16"/>
+              </w:rPr>
+            </w:pPr>
           </w:p>
         </w:tc>
       </w:tr>
@@ -4054,22 +3898,22 @@
           </w:tcPr>
           <w:p>
             <w:pPr>
-              <w:rPr>
-                <w:rFonts w:ascii="Arial" w:eastAsia="Arial" w:hAnsi="Arial" w:cs="Arial"/>
-                <w:color w:val="000000"/>
-                <w:sz w:val="16"/>
-                <w:szCs w:val="16"/>
-              </w:rPr>
-            </w:pPr>
-            <w:r>
-              <w:rPr>
-                <w:rFonts w:ascii="Arial" w:eastAsia="Arial" w:hAnsi="Arial" w:cs="Arial"/>
-                <w:color w:val="000000"/>
-                <w:sz w:val="16"/>
-                <w:szCs w:val="16"/>
-              </w:rPr>
-              <w:t>TÜV Rheinland (Guangdong) Ltd.</w:t>
-            </w:r>
+              <w:pBdr>
+                <w:top w:val="nil"/>
+                <w:left w:val="nil"/>
+                <w:bottom w:val="nil"/>
+                <w:right w:val="nil"/>
+                <w:between w:val="nil"/>
+              </w:pBdr>
+              <w:spacing w:line="252" w:lineRule="auto"/>
+              <w:ind w:left="107"/>
+              <w:rPr>
+                <w:rFonts w:ascii="Arial" w:eastAsia="Arial" w:hAnsi="Arial" w:cs="Arial"/>
+                <w:color w:val="000000"/>
+                <w:sz w:val="16"/>
+                <w:szCs w:val="16"/>
+              </w:rPr>
+            </w:pPr>
           </w:p>
         </w:tc>
       </w:tr>
@@ -4169,14 +4013,6 @@
                 <w:szCs w:val="16"/>
               </w:rPr>
             </w:pPr>
-            <w:r>
-              <w:rPr>
-                <w:rFonts w:ascii="Arial" w:eastAsia="Arial" w:hAnsi="Arial" w:cs="Arial"/>
-                <w:sz w:val="16"/>
-                <w:szCs w:val="16"/>
-              </w:rPr>
-              <w:t>https://www.tuv.com/world/en/locationfinder/location-detail-page_44795.html</w:t>
-            </w:r>
           </w:p>
         </w:tc>
       </w:tr>
@@ -4383,16 +4219,15 @@
                 <w:szCs w:val="16"/>
               </w:rPr>
             </w:pPr>
-            <w:hyperlink r:id="rId10">
+            <w:hyperlink r:id="rId11" w:history="1">
               <w:r>
                 <w:rPr>
+                  <w:rStyle w:val="Hipervnculo"/>
                   <w:rFonts w:ascii="Arial" w:eastAsia="Arial" w:hAnsi="Arial" w:cs="Arial"/>
-                  <w:color w:val="1155CC"/>
                   <w:sz w:val="16"/>
                   <w:szCs w:val="16"/>
-                  <w:u w:val="single"/>
                 </w:rPr>
-                <w:t>https://qr.gadnic.com/certifications/certificado-877-ee</w:t>
+                <w:t>https://qr.gadnic.com/certifications/certificado-ZZZ-ee</w:t>
               </w:r>
             </w:hyperlink>
           </w:p>
@@ -4446,24 +4281,6 @@
               </w:rPr>
               <w:t xml:space="preserve">ETIQUETA </w:t>
             </w:r>
-            <w:r>
-              <w:rPr>
-                <w:rFonts w:ascii="Arial" w:eastAsia="Arial" w:hAnsi="Arial" w:cs="Arial"/>
-                <w:sz w:val="16"/>
-                <w:szCs w:val="16"/>
-              </w:rPr>
-              <w:t xml:space="preserve"> </w:t>
-            </w:r>
-            <w:r>
-              <w:rPr>
-                <w:rFonts w:ascii="Arial" w:eastAsia="Arial" w:hAnsi="Arial" w:cs="Arial"/>
-                <w:b/>
-                <w:bCs/>
-                <w:sz w:val="16"/>
-                <w:szCs w:val="16"/>
-              </w:rPr>
-              <w:t>GADW10</w:t>
-            </w:r>
           </w:p>
           <w:p>
             <w:pPr>
@@ -4481,51 +4298,6 @@
                 <w:szCs w:val="16"/>
               </w:rPr>
             </w:pPr>
-            <w:r>
-              <w:rPr>
-                <w:rFonts w:ascii="Arial" w:eastAsia="Arial" w:hAnsi="Arial" w:cs="Arial"/>
-                <w:b/>
-                <w:bCs/>
-                <w:noProof/>
-                <w:sz w:val="16"/>
-                <w:szCs w:val="16"/>
-              </w:rPr>
-              <w:drawing>
-                <wp:inline distT="114300" distB="114300" distL="114300" distR="114300" wp14:anchorId="4A8846CE" wp14:editId="69113014">
-                  <wp:extent cx="2117725" cy="4077852"/>
-                  <wp:effectExtent l="0" t="0" r="0" b="0"/>
-                  <wp:docPr id="3" name="image3.png"/>
-                  <wp:cNvGraphicFramePr/>
-                  <a:graphic xmlns:a="http://schemas.openxmlformats.org/drawingml/2006/main">
-                    <a:graphicData uri="http://schemas.openxmlformats.org/drawingml/2006/picture">
-                      <pic:pic xmlns:pic="http://schemas.openxmlformats.org/drawingml/2006/picture">
-                        <pic:nvPicPr>
-                          <pic:cNvPr id="0" name="image3.png"/>
-                          <pic:cNvPicPr preferRelativeResize="0"/>
-                        </pic:nvPicPr>
-                        <pic:blipFill>
-                          <a:blip r:embed="rId11"/>
-                          <a:srcRect/>
-                          <a:stretch>
-                            <a:fillRect/>
-                          </a:stretch>
-                        </pic:blipFill>
-                        <pic:spPr>
-                          <a:xfrm>
-                            <a:off x="0" y="0"/>
-                            <a:ext cx="2117725" cy="4077852"/>
-                          </a:xfrm>
-                          <a:prstGeom prst="rect">
-                            <a:avLst/>
-                          </a:prstGeom>
-                          <a:ln/>
-                        </pic:spPr>
-                      </pic:pic>
-                    </a:graphicData>
-                  </a:graphic>
-                </wp:inline>
-              </w:drawing>
-            </w:r>
           </w:p>
           <w:p>
             <w:pPr>
@@ -4611,7 +4383,6 @@
                 <w:sz w:val="16"/>
                 <w:szCs w:val="16"/>
               </w:rPr>
-              <w:lastRenderedPageBreak/>
               <w:t>Fecha de Emisión</w:t>
             </w:r>
           </w:p>
@@ -4637,14 +4408,6 @@
                 <w:szCs w:val="16"/>
               </w:rPr>
             </w:pPr>
-            <w:r>
-              <w:rPr>
-                <w:rFonts w:ascii="Arial" w:eastAsia="Arial" w:hAnsi="Arial" w:cs="Arial"/>
-                <w:sz w:val="16"/>
-                <w:szCs w:val="16"/>
-              </w:rPr>
-              <w:t>12/05/2026</w:t>
-            </w:r>
           </w:p>
         </w:tc>
       </w:tr>
@@ -4864,7 +4627,79 @@
           <w:sz w:val="16"/>
           <w:szCs w:val="16"/>
         </w:rPr>
-        <w:t>La inexactitud, falsedad u omisión de carácter esencial de cualquier dato o información en esta Declaración, o la falta de presentación de la documentación requerida por la Autoridad, será pasible de las sanciones previstas en la Ley N° 24.240 y sus modificatorias, así como en el Decreto N° 274/2019, sin perjuicio de la responsabilidad penal, civil o administrativa aplicable, conforme al Artículo 110 del Reglamento de Procedimientos Administrativos, Decreto N° 1.759/72 – T.O. 2017.</w:t>
+        <w:t xml:space="preserve">La inexactitud, falsedad u omisión de carácter esencial de cualquier dato o información en esta Declaración, o la falta de presentación de la documentación requerida por la Autoridad, será pasible de las sanciones previstas en la Ley </w:t>
+      </w:r>
+      <w:proofErr w:type="spellStart"/>
+      <w:r>
+        <w:rPr>
+          <w:rFonts w:ascii="Arial" w:eastAsia="Arial" w:hAnsi="Arial" w:cs="Arial"/>
+          <w:i/>
+          <w:iCs/>
+          <w:color w:val="000000"/>
+          <w:sz w:val="16"/>
+          <w:szCs w:val="16"/>
+        </w:rPr>
+        <w:t>N°</w:t>
+      </w:r>
+      <w:proofErr w:type="spellEnd"/>
+      <w:r>
+        <w:rPr>
+          <w:rFonts w:ascii="Arial" w:eastAsia="Arial" w:hAnsi="Arial" w:cs="Arial"/>
+          <w:i/>
+          <w:iCs/>
+          <w:color w:val="000000"/>
+          <w:sz w:val="16"/>
+          <w:szCs w:val="16"/>
+        </w:rPr>
+        <w:t xml:space="preserve"> 24.240 y sus modificatorias, así como en el Decreto </w:t>
+      </w:r>
+      <w:proofErr w:type="spellStart"/>
+      <w:r>
+        <w:rPr>
+          <w:rFonts w:ascii="Arial" w:eastAsia="Arial" w:hAnsi="Arial" w:cs="Arial"/>
+          <w:i/>
+          <w:iCs/>
+          <w:color w:val="000000"/>
+          <w:sz w:val="16"/>
+          <w:szCs w:val="16"/>
+        </w:rPr>
+        <w:t>N°</w:t>
+      </w:r>
+      <w:proofErr w:type="spellEnd"/>
+      <w:r>
+        <w:rPr>
+          <w:rFonts w:ascii="Arial" w:eastAsia="Arial" w:hAnsi="Arial" w:cs="Arial"/>
+          <w:i/>
+          <w:iCs/>
+          <w:color w:val="000000"/>
+          <w:sz w:val="16"/>
+          <w:szCs w:val="16"/>
+        </w:rPr>
+        <w:t xml:space="preserve"> 274/2019, sin perjuicio de la responsabilidad penal, civil o administrativa aplicable, conforme al Artículo 110 del Reglamento de Procedimientos Administrativos, Decreto </w:t>
+      </w:r>
+      <w:proofErr w:type="spellStart"/>
+      <w:r>
+        <w:rPr>
+          <w:rFonts w:ascii="Arial" w:eastAsia="Arial" w:hAnsi="Arial" w:cs="Arial"/>
+          <w:i/>
+          <w:iCs/>
+          <w:color w:val="000000"/>
+          <w:sz w:val="16"/>
+          <w:szCs w:val="16"/>
+        </w:rPr>
+        <w:t>N°</w:t>
+      </w:r>
+      <w:proofErr w:type="spellEnd"/>
+      <w:r>
+        <w:rPr>
+          <w:rFonts w:ascii="Arial" w:eastAsia="Arial" w:hAnsi="Arial" w:cs="Arial"/>
+          <w:i/>
+          <w:iCs/>
+          <w:color w:val="000000"/>
+          <w:sz w:val="16"/>
+          <w:szCs w:val="16"/>
+        </w:rPr>
+        <w:t xml:space="preserve"> 1.759/72 – T.O. 2017.</w:t>
       </w:r>
     </w:p>
     <w:p>
@@ -4918,7 +4753,7 @@
           <w:noProof/>
         </w:rPr>
         <w:drawing>
-          <wp:anchor distT="0" distB="0" distL="0" distR="0" simplePos="0" relativeHeight="251659264" behindDoc="1" locked="0" layoutInCell="1" hidden="0" allowOverlap="1" wp14:anchorId="536E4C53" wp14:editId="4972FCEB">
+          <wp:anchor distT="0" distB="0" distL="0" distR="0" simplePos="0" relativeHeight="251659264" behindDoc="1" locked="0" layoutInCell="1" hidden="0" allowOverlap="1" wp14:anchorId="51AB7625" wp14:editId="39E04AD0">
             <wp:simplePos x="0" y="0"/>
             <wp:positionH relativeFrom="column">
               <wp:posOffset>3819525</wp:posOffset>
@@ -4929,13 +4764,13 @@
             <wp:extent cx="521569" cy="1022603"/>
             <wp:effectExtent l="0" t="0" r="0" b="0"/>
             <wp:wrapNone/>
-            <wp:docPr id="4" name="image1.png" descr="A close up of a signature&#10;&#10;AI-generated content may be incorrect."/>
+            <wp:docPr id="4" name="image3.png" descr="A close up of a signature&#10;&#10;AI-generated content may be incorrect."/>
             <wp:cNvGraphicFramePr/>
             <a:graphic xmlns:a="http://schemas.openxmlformats.org/drawingml/2006/main">
               <a:graphicData uri="http://schemas.openxmlformats.org/drawingml/2006/picture">
                 <pic:pic xmlns:pic="http://schemas.openxmlformats.org/drawingml/2006/picture">
                   <pic:nvPicPr>
-                    <pic:cNvPr id="0" name="image1.png" descr="A close up of a signature&#10;&#10;AI-generated content may be incorrect."/>
+                    <pic:cNvPr id="0" name="image3.png" descr="A close up of a signature&#10;&#10;AI-generated content may be incorrect."/>
                     <pic:cNvPicPr preferRelativeResize="0"/>
                   </pic:nvPicPr>
                   <pic:blipFill>
@@ -5372,9 +5207,9 @@
         <w:noProof/>
       </w:rPr>
       <mc:AlternateContent>
-        <mc:Choice Requires="wps">
+        <mc:Choice Requires="wpg">
           <w:drawing>
-            <wp:anchor distT="0" distB="0" distL="0" distR="0" simplePos="0" relativeHeight="251659264" behindDoc="1" locked="0" layoutInCell="1" hidden="0" allowOverlap="1" wp14:anchorId="744C7789" wp14:editId="3492C36C">
+            <wp:anchor distT="0" distB="0" distL="0" distR="0" simplePos="0" relativeHeight="251659264" behindDoc="1" locked="0" layoutInCell="1" hidden="0" allowOverlap="1" wp14:anchorId="09084F51" wp14:editId="1ED789D4">
               <wp:simplePos x="0" y="0"/>
               <wp:positionH relativeFrom="column">
                 <wp:posOffset>101600</wp:posOffset>
@@ -5430,28 +5265,47 @@
             </wp:anchor>
           </w:drawing>
         </mc:Choice>
-        <mc:Fallback>
-          <w:pict>
-            <v:rect w14:anchorId="744C7789" id="Rectángulo 2" o:spid="_x0000_s1042" style="position:absolute;margin-left:8pt;margin-top:730pt;width:12.35pt;height:13.8pt;z-index:-251657216;visibility:visible;mso-wrap-style:square;mso-wrap-distance-left:0;mso-wrap-distance-top:0;mso-wrap-distance-right:0;mso-wrap-distance-bottom:0;mso-position-horizontal:absolute;mso-position-horizontal-relative:text;mso-position-vertical:absolute;mso-position-vertical-relative:text;v-text-anchor:top" o:gfxdata="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" filled="f" stroked="f">
-              <v:textbox inset="0,0,0,0">
-                <w:txbxContent>
-                  <w:p>
-                    <w:pPr>
-                      <w:spacing w:line="245" w:lineRule="auto"/>
-                      <w:ind w:left="60" w:firstLine="60"/>
-                      <w:textDirection w:val="btLr"/>
-                    </w:pPr>
-                    <w:r>
-                      <w:rPr>
-                        <w:color w:val="000000"/>
-                      </w:rPr>
-                      <w:t xml:space="preserve"> PAGE 1</w:t>
-                    </w:r>
-                  </w:p>
-                </w:txbxContent>
-              </v:textbox>
-            </v:rect>
-          </w:pict>
+        <mc:Fallback xmlns:cr="http://schemas.microsoft.com/office/comments/2020/reactions" xmlns="http://schemas.microsoft.com/office/tasks/2019/documenttasks" xmlns:dgm="http://schemas.openxmlformats.org/drawingml/2006/diagram" xmlns:lc="http://schemas.openxmlformats.org/drawingml/2006/lockedCanvas" xmlns:c="http://schemas.openxmlformats.org/drawingml/2006/chart" xmlns:pic="http://schemas.openxmlformats.org/drawingml/2006/picture" xmlns:a="http://schemas.openxmlformats.org/drawingml/2006/main" xmlns:sl="http://schemas.openxmlformats.org/schemaLibrary/2006/main">
+          <w:drawing>
+            <wp:anchor allowOverlap="1" behindDoc="1" distB="0" distT="0" distL="0" distR="0" hidden="0" layoutInCell="1" locked="0" relativeHeight="0" simplePos="0">
+              <wp:simplePos x="0" y="0"/>
+              <wp:positionH relativeFrom="column">
+                <wp:posOffset>101600</wp:posOffset>
+              </wp:positionH>
+              <wp:positionV relativeFrom="paragraph">
+                <wp:posOffset>9271000</wp:posOffset>
+              </wp:positionV>
+              <wp:extent cx="156845" cy="175260"/>
+              <wp:effectExtent b="0" l="0" r="0" t="0"/>
+              <wp:wrapNone/>
+              <wp:docPr id="2" name="image5.png"/>
+              <a:graphic>
+                <a:graphicData uri="http://schemas.openxmlformats.org/drawingml/2006/picture">
+                  <pic:pic>
+                    <pic:nvPicPr>
+                      <pic:cNvPr id="0" name="image5.png"/>
+                      <pic:cNvPicPr preferRelativeResize="0"/>
+                    </pic:nvPicPr>
+                    <pic:blipFill>
+                      <a:blip r:embed="rId1"/>
+                      <a:srcRect/>
+                      <a:stretch>
+                        <a:fillRect/>
+                      </a:stretch>
+                    </pic:blipFill>
+                    <pic:spPr>
+                      <a:xfrm>
+                        <a:off x="0" y="0"/>
+                        <a:ext cx="156845" cy="175260"/>
+                      </a:xfrm>
+                      <a:prstGeom prst="rect"/>
+                      <a:ln/>
+                    </pic:spPr>
+                  </pic:pic>
+                </a:graphicData>
+              </a:graphic>
+            </wp:anchor>
+          </w:drawing>
         </mc:Fallback>
       </mc:AlternateContent>
     </w:r>
@@ -5497,7 +5351,7 @@
         <w:noProof/>
       </w:rPr>
       <w:drawing>
-        <wp:anchor distT="114300" distB="114300" distL="114300" distR="114300" simplePos="0" relativeHeight="251658240" behindDoc="0" locked="0" layoutInCell="1" hidden="0" allowOverlap="1" wp14:anchorId="44E299B6" wp14:editId="442FAEAA">
+        <wp:anchor distT="114300" distB="114300" distL="114300" distR="114300" simplePos="0" relativeHeight="251658240" behindDoc="0" locked="0" layoutInCell="1" hidden="0" allowOverlap="1" wp14:anchorId="65F94010" wp14:editId="261B869F">
           <wp:simplePos x="0" y="0"/>
           <wp:positionH relativeFrom="column">
             <wp:posOffset>1</wp:posOffset>
@@ -6267,6 +6121,29 @@
       </w:tblCellMar>
     </w:tblPr>
   </w:style>
+  <w:style w:type="character" w:styleId="Hipervnculo">
+    <w:name w:val="Hyperlink"/>
+    <w:basedOn w:val="Fuentedeprrafopredeter"/>
+    <w:uiPriority w:val="99"/>
+    <w:unhideWhenUsed/>
+    <w:rsid w:val="003B13C4"/>
+    <w:rPr>
+      <w:color w:val="0000FF" w:themeColor="hyperlink"/>
+      <w:u w:val="single"/>
+    </w:rPr>
+  </w:style>
+  <w:style w:type="character" w:styleId="Mencinsinresolver">
+    <w:name w:val="Unresolved Mention"/>
+    <w:basedOn w:val="Fuentedeprrafopredeter"/>
+    <w:uiPriority w:val="99"/>
+    <w:semiHidden/>
+    <w:unhideWhenUsed/>
+    <w:rsid w:val="003B13C4"/>
+    <w:rPr>
+      <w:color w:val="605E5C"/>
+      <w:shd w:val="clear" w:color="auto" w:fill="E1DFDD"/>
+    </w:rPr>
+  </w:style>
 </w:styles>
 </file>
 

</xml_diff>